<commit_message>
updated the help cheatsheet for ConsistentSpellFixer
</commit_message>
<xml_diff>
--- a/Installer/SFM Converter MM/Redist/Help for ConsistentSpellFixer.docx
+++ b/Installer/SFM Converter MM/Redist/Help for ConsistentSpellFixer.docx
@@ -4,313 +4,68 @@
   <w:body>
     <w:p>
       <w:pPr>
-        <w:pStyle w:val="Heading1"/>
-      </w:pPr>
-      <w:r>
-        <w:t>Cheat sheet for Consistent SpellFixer</w:t>
-      </w:r>
-    </w:p>
-    <w:p>
-      <w:pPr>
-        <w:pStyle w:val="ListParagraph"/>
-      </w:pPr>
-      <w:r>
-        <w:t>Basic Procedure:</w:t>
-      </w:r>
-    </w:p>
-    <w:p>
-      <w:pPr>
-        <w:pStyle w:val="ListParagraph"/>
-        <w:numPr>
-          <w:ilvl w:val="1"/>
-          <w:numId w:val="1"/>
-        </w:numPr>
-      </w:pPr>
-      <w:r>
-        <w:t>Open the Bulk SFM Converter</w:t>
-      </w:r>
-    </w:p>
-    <w:p>
-      <w:pPr>
-        <w:pStyle w:val="ListParagraph"/>
-        <w:numPr>
-          <w:ilvl w:val="1"/>
-          <w:numId w:val="1"/>
-        </w:numPr>
-      </w:pPr>
-      <w:r>
-        <w:t>Click the File, Open SFM Documents, Unicode</w:t>
-      </w:r>
-    </w:p>
-    <w:p>
-      <w:pPr>
-        <w:pStyle w:val="ListParagraph"/>
-        <w:numPr>
-          <w:ilvl w:val="1"/>
-          <w:numId w:val="1"/>
-        </w:numPr>
-      </w:pPr>
-      <w:r>
-        <w:t>Select all the SFM Documents you have in your corpus (e.g. all the SFM documents in, say, C:\My Paratext 9 Projects</w:t>
-      </w:r>
-      <w:r>
-        <w:t>\&lt;project&gt;</w:t>
-      </w:r>
-      <w:r>
-        <w:t xml:space="preserve"> folder). You might </w:t>
-      </w:r>
-      <w:r>
-        <w:t>not want to</w:t>
-      </w:r>
-      <w:r>
-        <w:t xml:space="preserve"> include any that don’t have words you want to check the spelling o</w:t>
-      </w:r>
-      <w:r>
-        <w:t>f.</w:t>
-      </w:r>
-    </w:p>
-    <w:p>
-      <w:pPr>
-        <w:pStyle w:val="ListParagraph"/>
-        <w:numPr>
-          <w:ilvl w:val="1"/>
-          <w:numId w:val="1"/>
-        </w:numPr>
-      </w:pPr>
-      <w:r>
-        <w:t xml:space="preserve">Click on the </w:t>
-      </w:r>
-      <w:r>
+        <w:pStyle w:val="Title"/>
+        <w:tabs>
+          <w:tab w:val="left" w:pos="3705"/>
+        </w:tabs>
+        <w:jc w:val="center"/>
         <w:rPr>
-          <w:rStyle w:val="Emphasis"/>
+          <w:color w:val="0F4761" w:themeColor="accent1" w:themeShade="BF"/>
+          <w:sz w:val="40"/>
+          <w:szCs w:val="36"/>
         </w:rPr>
-        <w:t>Consistent Spelling Options</w:t>
-      </w:r>
-      <w:r>
-        <w:t xml:space="preserve"> menu</w:t>
-      </w:r>
-      <w:r>
-        <w:t xml:space="preserve">, and </w:t>
-      </w:r>
-      <w:r>
-        <w:t xml:space="preserve">the </w:t>
-      </w:r>
-      <w:r>
-        <w:rPr>
-          <w:rStyle w:val="Emphasis"/>
-        </w:rPr>
-        <w:t>Select Consistent Changes Project…</w:t>
-      </w:r>
-      <w:r>
-        <w:t xml:space="preserve"> men</w:t>
-      </w:r>
-      <w:r>
-        <w:t>u</w:t>
-      </w:r>
-      <w:r>
-        <w:t>.</w:t>
-      </w:r>
-      <w:r>
-        <w:t xml:space="preserve"> If there are no projects shown, then click the </w:t>
-      </w:r>
-      <w:r>
-        <w:rPr>
-          <w:rStyle w:val="Emphasis"/>
-        </w:rPr>
-        <w:t>Add New Project</w:t>
-      </w:r>
-      <w:r>
-        <w:t xml:space="preserve"> button.</w:t>
-      </w:r>
-    </w:p>
-    <w:p>
-      <w:pPr>
-        <w:pStyle w:val="ListParagraph"/>
-        <w:numPr>
-          <w:ilvl w:val="1"/>
-          <w:numId w:val="1"/>
-        </w:numPr>
-      </w:pPr>
-      <w:r>
-        <w:t xml:space="preserve">Fill in the information (contact </w:t>
-      </w:r>
-      <w:hyperlink r:id="rId8" w:history="1">
-        <w:r>
-          <w:rPr>
-            <w:rStyle w:val="Hyperlink"/>
-          </w:rPr>
-          <w:t>silconverters_support@sil.org</w:t>
-        </w:r>
-      </w:hyperlink>
-      <w:r>
-        <w:t xml:space="preserve"> </w:t>
-      </w:r>
-      <w:r>
-        <w:t>for help depending on the language family you are using, but often the defaults can be used)</w:t>
-      </w:r>
-      <w:r>
-        <w:t>.</w:t>
-      </w:r>
-    </w:p>
-    <w:p>
-      <w:pPr>
-        <w:pStyle w:val="ListParagraph"/>
-        <w:numPr>
-          <w:ilvl w:val="1"/>
-          <w:numId w:val="1"/>
-        </w:numPr>
-      </w:pPr>
-      <w:r>
-        <w:t xml:space="preserve">Once you select the project and click </w:t>
-      </w:r>
-      <w:r>
-        <w:rPr>
-          <w:rStyle w:val="Emphasis"/>
-        </w:rPr>
-        <w:t>OK</w:t>
-      </w:r>
-      <w:r>
-        <w:t xml:space="preserve">, the converter for the SFM markers commonly having data that needs to be spell checked will be initialized with the name of the converter used for fixing bad spellings (e.g. </w:t>
-      </w:r>
-      <w:r>
-        <w:rPr>
-          <w:rStyle w:val="Emphasis"/>
-        </w:rPr>
-        <w:t>Consistent Spelling for Kangri</w:t>
-      </w:r>
-      <w:r>
-        <w:t>) so that the data in those markers will be checked for similar spelling. You can click on the center column buttons if you want to include other fields that aren’t initialized (they’ll say “Click to check spelling” if they’re not initialized).</w:t>
-      </w:r>
-    </w:p>
-    <w:p>
-      <w:pPr>
-        <w:pStyle w:val="ListParagraph"/>
-        <w:numPr>
-          <w:ilvl w:val="1"/>
-          <w:numId w:val="1"/>
-        </w:numPr>
-      </w:pPr>
-      <w:r>
-        <w:t xml:space="preserve">Click on the </w:t>
-      </w:r>
-      <w:r>
-        <w:rPr>
-          <w:rStyle w:val="Emphasis"/>
-        </w:rPr>
-        <w:t>Consistent Spelling Options</w:t>
-      </w:r>
-      <w:r>
-        <w:t xml:space="preserve"> menu</w:t>
-      </w:r>
-      <w:r>
-        <w:t xml:space="preserve"> again</w:t>
-      </w:r>
-      <w:r>
-        <w:t xml:space="preserve">, and </w:t>
-      </w:r>
-      <w:proofErr w:type="gramStart"/>
-      <w:r>
-        <w:t>the</w:t>
-      </w:r>
-      <w:r>
-        <w:t xml:space="preserve"> </w:t>
-      </w:r>
-      <w:r>
-        <w:rPr>
-          <w:rStyle w:val="Emphasis"/>
-        </w:rPr>
-        <w:t>Analyze</w:t>
-      </w:r>
-      <w:proofErr w:type="gramEnd"/>
-      <w:r>
-        <w:rPr>
-          <w:rStyle w:val="Emphasis"/>
-        </w:rPr>
-        <w:t xml:space="preserve"> Data for Consistent Spelling</w:t>
-      </w:r>
-      <w:r>
-        <w:t xml:space="preserve"> menu. This will</w:t>
-      </w:r>
-      <w:r>
-        <w:t xml:space="preserve"> launch another dialog (see examples below) that will have similarly spelled words in one or more rows in bundles of ambiguous words.</w:t>
-      </w:r>
-      <w:r>
-        <w:t xml:space="preserve"> This dialog loads in the background, but you don’t have to wait for it to finish before beginning the </w:t>
-      </w:r>
-      <w:proofErr w:type="gramStart"/>
-      <w:r>
-        <w:t>selecting</w:t>
-      </w:r>
-      <w:proofErr w:type="gramEnd"/>
-      <w:r>
-        <w:t xml:space="preserve"> process discussed below:</w:t>
-      </w:r>
-    </w:p>
-    <w:p>
-      <w:pPr>
-        <w:pStyle w:val="ListParagraph"/>
-        <w:numPr>
-          <w:ilvl w:val="0"/>
-          <w:numId w:val="0"/>
-        </w:numPr>
-        <w:ind w:left="1800"/>
-      </w:pPr>
-    </w:p>
-    <w:p>
-      <w:pPr>
-        <w:pStyle w:val="ListParagraph"/>
-      </w:pPr>
-      <w:r>
-        <w:t>Some rows of the table have bigger spaces above and below. All the rows inside the bigger space boundaries are “ambiguous” with each other. It might be a single row of a left and right word that are ambiguous with each other, or it might be multiple rows where the right-hand side word</w:t>
-      </w:r>
-      <w:r>
-        <w:t xml:space="preserve"> of all rows in the ‘bundle’</w:t>
-      </w:r>
-      <w:r>
-        <w:t xml:space="preserve"> </w:t>
-      </w:r>
-      <w:r>
-        <w:t xml:space="preserve">is the same word and </w:t>
-      </w:r>
-      <w:r>
-        <w:t xml:space="preserve">is the most frequently used spelling (and therefore more likely might be the correct spelling of </w:t>
-      </w:r>
-      <w:r>
-        <w:t xml:space="preserve">one or more of the </w:t>
-      </w:r>
-      <w:r>
-        <w:t>word</w:t>
+      </w:pPr>
+      <w:r>
+        <w:t>Consistent SpellFixer</w:t>
+      </w:r>
+    </w:p>
+    <w:p>
+      <w:pPr>
+        <w:pStyle w:val="Quote"/>
+      </w:pPr>
+      <w:r>
+        <w:t xml:space="preserve">Are there multiple ways to spell a word in your language? Do you need to be able to standardize on a single form? Then Consistent SpellFixer </w:t>
+      </w:r>
+      <w:r>
+        <w:t xml:space="preserve">(part of SILConverters) </w:t>
+      </w:r>
+      <w:r>
+        <w:t xml:space="preserve">is a tool that can help you. </w:t>
+      </w:r>
+    </w:p>
+    <w:p>
+      <w:pPr>
+        <w:pStyle w:val="Quote"/>
+      </w:pPr>
+      <w:r>
+        <w:t xml:space="preserve">The tool will </w:t>
+      </w:r>
+      <w:r>
+        <w:t xml:space="preserve">load </w:t>
+      </w:r>
+      <w:r>
+        <w:t>your text corpus from SFM files (e.g. Paratext). Then it will show similarly spelled words in bundle</w:t>
       </w:r>
       <w:r>
         <w:t>s</w:t>
       </w:r>
       <w:r>
-        <w:t xml:space="preserve"> on the left)</w:t>
-      </w:r>
-      <w:r>
-        <w:t>. T</w:t>
-      </w:r>
-      <w:r>
-        <w:t>he left-hand side words are the various other words that are part of the same ambiguous bundle</w:t>
-      </w:r>
-      <w:r>
-        <w:t>:</w:t>
-      </w:r>
-    </w:p>
-    <w:p>
-      <w:pPr>
-        <w:ind w:left="720"/>
+        <w:t xml:space="preserve"> like this:</w:t>
+      </w:r>
+    </w:p>
+    <w:p>
+      <w:pPr>
+        <w:jc w:val="center"/>
       </w:pPr>
       <w:r>
         <w:rPr>
           <w:noProof/>
         </w:rPr>
-        <w:lastRenderedPageBreak/>
         <w:drawing>
-          <wp:inline distT="0" distB="0" distL="0" distR="0" wp14:anchorId="2B4D0D6D" wp14:editId="5C43717C">
+          <wp:inline distT="0" distB="0" distL="0" distR="0" wp14:anchorId="6C6B3F54" wp14:editId="69696303">
             <wp:extent cx="5943600" cy="2571750"/>
             <wp:effectExtent l="0" t="0" r="0" b="0"/>
-            <wp:docPr id="1766553706" name="Picture 2"/>
+            <wp:docPr id="1922697244" name="Picture 2"/>
             <wp:cNvGraphicFramePr>
               <a:graphicFrameLocks xmlns:a="http://schemas.openxmlformats.org/drawingml/2006/main" noChangeAspect="1"/>
             </wp:cNvGraphicFramePr>
@@ -324,7 +79,7 @@
                     </pic:cNvPicPr>
                   </pic:nvPicPr>
                   <pic:blipFill>
-                    <a:blip r:embed="rId9">
+                    <a:blip r:embed="rId8">
                       <a:extLst>
                         <a:ext uri="{28A0092B-C50C-407E-A947-70E740481C1C}">
                           <a14:useLocalDpi xmlns:a14="http://schemas.microsoft.com/office/drawing/2010/main" val="0"/>
@@ -358,6 +113,493 @@
     </w:p>
     <w:p>
       <w:pPr>
+        <w:pStyle w:val="Quote"/>
+      </w:pPr>
+      <w:r>
+        <w:t>Then you choose which spelling is the one you want to standardize on</w:t>
+      </w:r>
+      <w:r>
+        <w:t xml:space="preserve"> by clicking on the form you want</w:t>
+      </w:r>
+      <w:r>
+        <w:t xml:space="preserve"> (left- or right-hand side, OR both </w:t>
+      </w:r>
+      <w:r>
+        <w:t xml:space="preserve">may be </w:t>
+      </w:r>
+      <w:r>
+        <w:t>valid)</w:t>
+      </w:r>
+      <w:r>
+        <w:t xml:space="preserve">. </w:t>
+      </w:r>
+    </w:p>
+    <w:p>
+      <w:pPr>
+        <w:pStyle w:val="Quote"/>
+      </w:pPr>
+      <w:r>
+        <w:t xml:space="preserve">When you save the results, a Consistent Changes (CC) table will be </w:t>
+      </w:r>
+      <w:r>
+        <w:t xml:space="preserve">created </w:t>
+      </w:r>
+      <w:r>
+        <w:t>which you can use to process your corpus to make the spelling changes.</w:t>
+      </w:r>
+    </w:p>
+    <w:p>
+      <w:pPr>
+        <w:jc w:val="center"/>
+      </w:pPr>
+      <w:r>
+        <w:rPr>
+          <w:noProof/>
+        </w:rPr>
+        <w:drawing>
+          <wp:inline distT="0" distB="0" distL="0" distR="0" wp14:anchorId="577873EE" wp14:editId="43046839">
+            <wp:extent cx="5943600" cy="2324100"/>
+            <wp:effectExtent l="0" t="0" r="0" b="0"/>
+            <wp:docPr id="698706404" name="Picture 7"/>
+            <wp:cNvGraphicFramePr>
+              <a:graphicFrameLocks xmlns:a="http://schemas.openxmlformats.org/drawingml/2006/main" noChangeAspect="1"/>
+            </wp:cNvGraphicFramePr>
+            <a:graphic xmlns:a="http://schemas.openxmlformats.org/drawingml/2006/main">
+              <a:graphicData uri="http://schemas.openxmlformats.org/drawingml/2006/picture">
+                <pic:pic xmlns:pic="http://schemas.openxmlformats.org/drawingml/2006/picture">
+                  <pic:nvPicPr>
+                    <pic:cNvPr id="0" name="Picture 7"/>
+                    <pic:cNvPicPr>
+                      <a:picLocks noChangeAspect="1" noChangeArrowheads="1"/>
+                    </pic:cNvPicPr>
+                  </pic:nvPicPr>
+                  <pic:blipFill>
+                    <a:blip r:embed="rId9">
+                      <a:extLst>
+                        <a:ext uri="{28A0092B-C50C-407E-A947-70E740481C1C}">
+                          <a14:useLocalDpi xmlns:a14="http://schemas.microsoft.com/office/drawing/2010/main" val="0"/>
+                        </a:ext>
+                      </a:extLst>
+                    </a:blip>
+                    <a:srcRect/>
+                    <a:stretch>
+                      <a:fillRect/>
+                    </a:stretch>
+                  </pic:blipFill>
+                  <pic:spPr bwMode="auto">
+                    <a:xfrm>
+                      <a:off x="0" y="0"/>
+                      <a:ext cx="5943600" cy="2324100"/>
+                    </a:xfrm>
+                    <a:prstGeom prst="rect">
+                      <a:avLst/>
+                    </a:prstGeom>
+                    <a:noFill/>
+                    <a:ln>
+                      <a:noFill/>
+                    </a:ln>
+                  </pic:spPr>
+                </pic:pic>
+              </a:graphicData>
+            </a:graphic>
+          </wp:inline>
+        </w:drawing>
+      </w:r>
+    </w:p>
+    <w:p>
+      <w:r>
+        <w:br w:type="page"/>
+      </w:r>
+    </w:p>
+    <w:p>
+      <w:pPr>
+        <w:pStyle w:val="Heading1"/>
+      </w:pPr>
+      <w:r>
+        <w:lastRenderedPageBreak/>
+        <w:t>Cheat sheet for Consistent SpellFixer</w:t>
+      </w:r>
+    </w:p>
+    <w:p>
+      <w:pPr>
+        <w:pStyle w:val="ListParagraph"/>
+      </w:pPr>
+      <w:r>
+        <w:t>Basic Procedure:</w:t>
+      </w:r>
+    </w:p>
+    <w:p>
+      <w:pPr>
+        <w:pStyle w:val="ListParagraph"/>
+        <w:numPr>
+          <w:ilvl w:val="1"/>
+          <w:numId w:val="1"/>
+        </w:numPr>
+      </w:pPr>
+      <w:r>
+        <w:t xml:space="preserve">Install </w:t>
+      </w:r>
+      <w:r>
+        <w:rPr>
+          <w:rStyle w:val="QuoteChar"/>
+        </w:rPr>
+        <w:t>SILConverters 5.4.*</w:t>
+      </w:r>
+      <w:r>
+        <w:t xml:space="preserve"> or newer. </w:t>
+      </w:r>
+    </w:p>
+    <w:p>
+      <w:pPr>
+        <w:pStyle w:val="ListParagraph"/>
+        <w:numPr>
+          <w:ilvl w:val="1"/>
+          <w:numId w:val="1"/>
+        </w:numPr>
+      </w:pPr>
+      <w:r>
+        <w:t xml:space="preserve">Open the </w:t>
+      </w:r>
+      <w:r>
+        <w:rPr>
+          <w:rStyle w:val="QuoteChar"/>
+        </w:rPr>
+        <w:t>Bulk SFM Converter</w:t>
+      </w:r>
+    </w:p>
+    <w:p>
+      <w:pPr>
+        <w:pStyle w:val="ListParagraph"/>
+        <w:numPr>
+          <w:ilvl w:val="1"/>
+          <w:numId w:val="1"/>
+        </w:numPr>
+      </w:pPr>
+      <w:r>
+        <w:t xml:space="preserve">Click the </w:t>
+      </w:r>
+      <w:r>
+        <w:rPr>
+          <w:rStyle w:val="QuoteChar"/>
+        </w:rPr>
+        <w:t>File</w:t>
+      </w:r>
+      <w:r>
+        <w:t xml:space="preserve">, </w:t>
+      </w:r>
+      <w:r>
+        <w:rPr>
+          <w:rStyle w:val="QuoteChar"/>
+        </w:rPr>
+        <w:t>Open SFM Documents</w:t>
+      </w:r>
+      <w:r>
+        <w:t xml:space="preserve">, </w:t>
+      </w:r>
+      <w:r>
+        <w:rPr>
+          <w:rStyle w:val="QuoteChar"/>
+        </w:rPr>
+        <w:t>Unicode</w:t>
+      </w:r>
+      <w:r>
+        <w:t xml:space="preserve"> menu.</w:t>
+      </w:r>
+    </w:p>
+    <w:p>
+      <w:pPr>
+        <w:pStyle w:val="ListParagraph"/>
+        <w:numPr>
+          <w:ilvl w:val="1"/>
+          <w:numId w:val="1"/>
+        </w:numPr>
+      </w:pPr>
+      <w:r>
+        <w:t>Select all the SFM Documents you have in your corpus (e.g. all the SFM documents in, say, C:\My Paratext 9 Projects</w:t>
+      </w:r>
+      <w:r>
+        <w:t>\&lt;project&gt;</w:t>
+      </w:r>
+      <w:r>
+        <w:t xml:space="preserve"> folder). You might </w:t>
+      </w:r>
+      <w:r>
+        <w:t>not want to</w:t>
+      </w:r>
+      <w:r>
+        <w:t xml:space="preserve"> include any that don’t have words you want to check the spelling o</w:t>
+      </w:r>
+      <w:r>
+        <w:t>f.</w:t>
+      </w:r>
+    </w:p>
+    <w:p>
+      <w:pPr>
+        <w:pStyle w:val="ListParagraph"/>
+        <w:numPr>
+          <w:ilvl w:val="1"/>
+          <w:numId w:val="1"/>
+        </w:numPr>
+      </w:pPr>
+      <w:r>
+        <w:t xml:space="preserve">Click on the </w:t>
+      </w:r>
+      <w:r>
+        <w:rPr>
+          <w:rStyle w:val="QuoteChar"/>
+        </w:rPr>
+        <w:t>Consistent Spelling Options</w:t>
+      </w:r>
+      <w:r>
+        <w:t xml:space="preserve"> menu</w:t>
+      </w:r>
+      <w:r>
+        <w:t xml:space="preserve">, and </w:t>
+      </w:r>
+      <w:r>
+        <w:t xml:space="preserve">the </w:t>
+      </w:r>
+      <w:r>
+        <w:rPr>
+          <w:rStyle w:val="Emphasis"/>
+        </w:rPr>
+        <w:t>Select Consistent Changes Project…</w:t>
+      </w:r>
+      <w:r>
+        <w:t xml:space="preserve"> men</w:t>
+      </w:r>
+      <w:r>
+        <w:t>u</w:t>
+      </w:r>
+      <w:r>
+        <w:t>.</w:t>
+      </w:r>
+      <w:r>
+        <w:t xml:space="preserve"> If there are no projects shown, then click the </w:t>
+      </w:r>
+      <w:r>
+        <w:rPr>
+          <w:rStyle w:val="Emphasis"/>
+        </w:rPr>
+        <w:t>Add New Project</w:t>
+      </w:r>
+      <w:r>
+        <w:t xml:space="preserve"> button.</w:t>
+      </w:r>
+    </w:p>
+    <w:p>
+      <w:pPr>
+        <w:pStyle w:val="ListParagraph"/>
+        <w:numPr>
+          <w:ilvl w:val="1"/>
+          <w:numId w:val="1"/>
+        </w:numPr>
+      </w:pPr>
+      <w:r>
+        <w:t xml:space="preserve">Fill in the information (contact </w:t>
+      </w:r>
+      <w:hyperlink r:id="rId10" w:history="1">
+        <w:r>
+          <w:rPr>
+            <w:rStyle w:val="Hyperlink"/>
+          </w:rPr>
+          <w:t>silconverters_support@sil.org</w:t>
+        </w:r>
+      </w:hyperlink>
+      <w:r>
+        <w:t xml:space="preserve"> </w:t>
+      </w:r>
+      <w:r>
+        <w:t>for help depending on the language family you are using, but often the defaults can be used)</w:t>
+      </w:r>
+      <w:r>
+        <w:t>.</w:t>
+      </w:r>
+    </w:p>
+    <w:p>
+      <w:pPr>
+        <w:pStyle w:val="ListParagraph"/>
+        <w:numPr>
+          <w:ilvl w:val="1"/>
+          <w:numId w:val="1"/>
+        </w:numPr>
+      </w:pPr>
+      <w:r>
+        <w:t xml:space="preserve">Once you select the project and click </w:t>
+      </w:r>
+      <w:r>
+        <w:rPr>
+          <w:rStyle w:val="Emphasis"/>
+        </w:rPr>
+        <w:t>OK</w:t>
+      </w:r>
+      <w:r>
+        <w:t xml:space="preserve">, the converter for the SFM markers commonly having data that needs to be spell checked will be initialized with the name of the converter used for fixing bad spellings (e.g. </w:t>
+      </w:r>
+      <w:r>
+        <w:rPr>
+          <w:rStyle w:val="Emphasis"/>
+        </w:rPr>
+        <w:t>Consistent Spelling for Kangri</w:t>
+      </w:r>
+      <w:r>
+        <w:t>) so that the data in those markers will be checked for similar spelling. You can click on the center column buttons if you want to include other fields that aren’t initialized (they’ll say “Click to check spelling” if they’re not initialized).</w:t>
+      </w:r>
+    </w:p>
+    <w:p>
+      <w:pPr>
+        <w:pStyle w:val="ListParagraph"/>
+        <w:numPr>
+          <w:ilvl w:val="1"/>
+          <w:numId w:val="1"/>
+        </w:numPr>
+      </w:pPr>
+      <w:r>
+        <w:t xml:space="preserve">Click on the </w:t>
+      </w:r>
+      <w:r>
+        <w:rPr>
+          <w:rStyle w:val="Emphasis"/>
+        </w:rPr>
+        <w:t>Consistent Spelling Options</w:t>
+      </w:r>
+      <w:r>
+        <w:t xml:space="preserve"> menu again, and the </w:t>
+      </w:r>
+      <w:r>
+        <w:rPr>
+          <w:rStyle w:val="Emphasis"/>
+        </w:rPr>
+        <w:t>Analyze Data for Consistent Spelling</w:t>
+      </w:r>
+      <w:r>
+        <w:t xml:space="preserve"> menu. This will</w:t>
+      </w:r>
+      <w:r>
+        <w:t xml:space="preserve"> launch another dialog (see examples below) that will have similarly spelled words in one or more rows in bundles of ambiguous words.</w:t>
+      </w:r>
+      <w:r>
+        <w:t xml:space="preserve"> This dialog loads in the background, but you </w:t>
+      </w:r>
+      <w:r>
+        <w:t xml:space="preserve">may </w:t>
+      </w:r>
+      <w:r>
+        <w:t>have to wait for it to finish before beginning the selecting process discussed below:</w:t>
+      </w:r>
+    </w:p>
+    <w:p>
+      <w:pPr>
+        <w:pStyle w:val="ListParagraph"/>
+        <w:numPr>
+          <w:ilvl w:val="0"/>
+          <w:numId w:val="0"/>
+        </w:numPr>
+        <w:ind w:left="1800"/>
+      </w:pPr>
+    </w:p>
+    <w:p>
+      <w:pPr>
+        <w:pStyle w:val="ListParagraph"/>
+      </w:pPr>
+      <w:r>
+        <w:t>Some rows of the table have bigger spaces above and below. All the rows inside the bigger space boundaries are “ambiguous” with each other. It might be a single row of a left and right word that are ambiguous with each other, or it might be multiple rows where the right-hand side word</w:t>
+      </w:r>
+      <w:r>
+        <w:t xml:space="preserve"> of all rows in the ‘bundle’</w:t>
+      </w:r>
+      <w:r>
+        <w:t xml:space="preserve"> </w:t>
+      </w:r>
+      <w:r>
+        <w:t xml:space="preserve">is the same word and </w:t>
+      </w:r>
+      <w:r>
+        <w:t xml:space="preserve">is the most frequently used spelling (and therefore more likely might be the correct spelling of </w:t>
+      </w:r>
+      <w:r>
+        <w:t xml:space="preserve">one or more of the </w:t>
+      </w:r>
+      <w:r>
+        <w:t>word</w:t>
+      </w:r>
+      <w:r>
+        <w:t>s</w:t>
+      </w:r>
+      <w:r>
+        <w:t xml:space="preserve"> on the left)</w:t>
+      </w:r>
+      <w:r>
+        <w:t>. T</w:t>
+      </w:r>
+      <w:r>
+        <w:t>he left-hand side words are the various other words that are part of the same ambiguous bundle</w:t>
+      </w:r>
+      <w:r>
+        <w:t>:</w:t>
+      </w:r>
+    </w:p>
+    <w:p>
+      <w:pPr>
+        <w:ind w:left="720"/>
+      </w:pPr>
+      <w:r>
+        <w:rPr>
+          <w:noProof/>
+        </w:rPr>
+        <w:lastRenderedPageBreak/>
+        <w:drawing>
+          <wp:inline distT="0" distB="0" distL="0" distR="0" wp14:anchorId="2B4D0D6D" wp14:editId="5C43717C">
+            <wp:extent cx="5943600" cy="2571750"/>
+            <wp:effectExtent l="0" t="0" r="0" b="0"/>
+            <wp:docPr id="1766553706" name="Picture 2"/>
+            <wp:cNvGraphicFramePr>
+              <a:graphicFrameLocks xmlns:a="http://schemas.openxmlformats.org/drawingml/2006/main" noChangeAspect="1"/>
+            </wp:cNvGraphicFramePr>
+            <a:graphic xmlns:a="http://schemas.openxmlformats.org/drawingml/2006/main">
+              <a:graphicData uri="http://schemas.openxmlformats.org/drawingml/2006/picture">
+                <pic:pic xmlns:pic="http://schemas.openxmlformats.org/drawingml/2006/picture">
+                  <pic:nvPicPr>
+                    <pic:cNvPr id="0" name="Picture 2"/>
+                    <pic:cNvPicPr>
+                      <a:picLocks noChangeAspect="1" noChangeArrowheads="1"/>
+                    </pic:cNvPicPr>
+                  </pic:nvPicPr>
+                  <pic:blipFill>
+                    <a:blip r:embed="rId8">
+                      <a:extLst>
+                        <a:ext uri="{28A0092B-C50C-407E-A947-70E740481C1C}">
+                          <a14:useLocalDpi xmlns:a14="http://schemas.microsoft.com/office/drawing/2010/main" val="0"/>
+                        </a:ext>
+                      </a:extLst>
+                    </a:blip>
+                    <a:srcRect/>
+                    <a:stretch>
+                      <a:fillRect/>
+                    </a:stretch>
+                  </pic:blipFill>
+                  <pic:spPr bwMode="auto">
+                    <a:xfrm>
+                      <a:off x="0" y="0"/>
+                      <a:ext cx="5943600" cy="2571750"/>
+                    </a:xfrm>
+                    <a:prstGeom prst="rect">
+                      <a:avLst/>
+                    </a:prstGeom>
+                    <a:noFill/>
+                    <a:ln>
+                      <a:noFill/>
+                    </a:ln>
+                  </pic:spPr>
+                </pic:pic>
+              </a:graphicData>
+            </a:graphic>
+          </wp:inline>
+        </w:drawing>
+      </w:r>
+    </w:p>
+    <w:p>
+      <w:pPr>
         <w:pStyle w:val="ListParagraph"/>
       </w:pPr>
       <w:r>
@@ -403,10 +645,7 @@
         <w:t xml:space="preserve"> </w:t>
       </w:r>
       <w:r>
-        <w:t>showing some of the contexts</w:t>
-      </w:r>
-      <w:r>
-        <w:t xml:space="preserve"> in which the word appears</w:t>
+        <w:t>showing some of the contexts in which the word appears</w:t>
       </w:r>
       <w:r>
         <w:t>:</w:t>
@@ -438,7 +677,7 @@
                     </pic:cNvPicPr>
                   </pic:nvPicPr>
                   <pic:blipFill>
-                    <a:blip r:embed="rId10">
+                    <a:blip r:embed="rId11">
                       <a:extLst>
                         <a:ext uri="{28A0092B-C50C-407E-A947-70E740481C1C}">
                           <a14:useLocalDpi xmlns:a14="http://schemas.microsoft.com/office/drawing/2010/main" val="0"/>
@@ -511,6 +750,9 @@
         <w:t xml:space="preserve"> folder</w:t>
       </w:r>
       <w:r>
+        <w:t xml:space="preserve"> to change this value</w:t>
+      </w:r>
+      <w:r>
         <w:t>)</w:t>
       </w:r>
       <w:r>
@@ -540,19 +782,14 @@
         <w:t>Vernacular</w:t>
       </w:r>
       <w:r>
-        <w:t xml:space="preserve"> </w:t>
-      </w:r>
-      <w:r>
-        <w:t xml:space="preserve">column </w:t>
+        <w:t xml:space="preserve"> column </w:t>
       </w:r>
       <w:r>
         <w:t xml:space="preserve">to indicate that either the left or </w:t>
       </w:r>
-      <w:proofErr w:type="gramStart"/>
-      <w:r>
-        <w:t>right side</w:t>
-      </w:r>
-      <w:proofErr w:type="gramEnd"/>
+      <w:r>
+        <w:t>right-side</w:t>
+      </w:r>
       <w:r>
         <w:t xml:space="preserve"> word is the correct spelling of the other. This will put an arrow pointing to the </w:t>
       </w:r>
@@ -593,7 +830,7 @@
                     </pic:cNvPicPr>
                   </pic:nvPicPr>
                   <pic:blipFill>
-                    <a:blip r:embed="rId11">
+                    <a:blip r:embed="rId9">
                       <a:extLst>
                         <a:ext uri="{28A0092B-C50C-407E-A947-70E740481C1C}">
                           <a14:useLocalDpi xmlns:a14="http://schemas.microsoft.com/office/drawing/2010/main" val="0"/>
@@ -713,16 +950,11 @@
       <w:r>
         <w:t xml:space="preserve">You can </w:t>
       </w:r>
-      <w:proofErr w:type="gramStart"/>
       <w:r>
         <w:t>left-</w:t>
       </w:r>
       <w:r>
-        <w:t>click</w:t>
-      </w:r>
-      <w:proofErr w:type="gramEnd"/>
-      <w:r>
-        <w:t xml:space="preserve"> again on the center button to undo a selection made previously.</w:t>
+        <w:t>click again on the center button to undo a selection made previously.</w:t>
       </w:r>
     </w:p>
     <w:p>
@@ -1200,13 +1432,7 @@
         <w:pStyle w:val="ListParagraph"/>
       </w:pPr>
       <w:r>
-        <w:t xml:space="preserve">As you make selections in each row </w:t>
-      </w:r>
-      <w:r>
-        <w:t>–</w:t>
-      </w:r>
-      <w:r>
-        <w:t xml:space="preserve"> whether one side is the correction of the other or both sides are valid words – it is best to work through all the ambiguous bundles before closing the dialog. And you should save your work often (by clicking on </w:t>
+        <w:t xml:space="preserve">As you make selections in each row – whether one side is the correction of the other or both sides are valid words – it is best to work through all the ambiguous bundles before closing the dialog. And you should save your work often (by clicking on </w:t>
       </w:r>
       <w:r>
         <w:rPr>
@@ -1242,15 +1468,7 @@
         <w:t>Save and Exit</w:t>
       </w:r>
       <w:r>
-        <w:t xml:space="preserve">), it will reload </w:t>
-      </w:r>
-      <w:proofErr w:type="gramStart"/>
-      <w:r>
-        <w:t>all of</w:t>
-      </w:r>
-      <w:proofErr w:type="gramEnd"/>
-      <w:r>
-        <w:t xml:space="preserve"> the words that you’ve already processed in case you want/need to change your answer.</w:t>
+        <w:t>), it will reload all of the words that you’ve already processed in case you want/need to change your answer.</w:t>
       </w:r>
     </w:p>
     <w:p>
@@ -1258,15 +1476,13 @@
         <w:pStyle w:val="ListParagraph"/>
       </w:pPr>
       <w:r>
-        <w:t xml:space="preserve">It is important as you process a word as being the correction of another word that the bad spelling word is always bad. When you eventually go to correct the spelling of documents (e.g. the SFM documents you loaded other otherwise), it will always change the bad spelling for to the good spelling form. </w:t>
-      </w:r>
-      <w:proofErr w:type="gramStart"/>
-      <w:r>
-        <w:t>So</w:t>
-      </w:r>
-      <w:proofErr w:type="gramEnd"/>
-      <w:r>
-        <w:t xml:space="preserve"> you don’t want to use this to correct two distinct words that you realize are different words and need to be separated.</w:t>
+        <w:t>It is important as you process a word as being the correction of another word that the bad spelling word is always bad. When you eventually go to correct the spelling of documents (e.g. the SFM documents you loaded), it will always change the bad spelling for</w:t>
+      </w:r>
+      <w:r>
+        <w:t>m</w:t>
+      </w:r>
+      <w:r>
+        <w:t xml:space="preserve"> to the good spelling form. So you don’t want to use this to correct two distinct words that you realize are different words and need to be separated.</w:t>
       </w:r>
     </w:p>
     <w:p>
@@ -1285,16 +1501,12 @@
         </w:r>
       </w:hyperlink>
       <w:r>
-        <w:t xml:space="preserve"> if you intend to use this tool, to get further guidance (I am not writing every suggestion for how you might use the results of this</w:t>
-      </w:r>
-      <w:r>
-        <w:t xml:space="preserve"> process</w:t>
-      </w:r>
-      <w:r>
-        <w:t>, since I wrote this for my own needs and if no one else ever uses it, I’d rather not spend the time writing it up :-)</w:t>
-      </w:r>
-    </w:p>
-    <w:p/>
+        <w:t xml:space="preserve"> if you </w:t>
+      </w:r>
+      <w:r>
+        <w:t>have any questions or need help setting it up.</w:t>
+      </w:r>
+    </w:p>
     <w:sectPr>
       <w:pgSz w:w="12240" w:h="15840"/>
       <w:pgMar w:top="1440" w:right="1440" w:bottom="1440" w:left="1440" w:header="720" w:footer="720" w:gutter="0"/>

</xml_diff>

<commit_message>
updated help for ConsistentSpellFixer and added a 1-pager for the EMDC booth.
</commit_message>
<xml_diff>
--- a/Installer/SFM Converter MM/Redist/Help for ConsistentSpellFixer.docx
+++ b/Installer/SFM Converter MM/Redist/Help for ConsistentSpellFixer.docx
@@ -62,9 +62,9 @@
           <w:noProof/>
         </w:rPr>
         <w:drawing>
-          <wp:inline distT="0" distB="0" distL="0" distR="0" wp14:anchorId="6C6B3F54" wp14:editId="69696303">
-            <wp:extent cx="5943600" cy="2571750"/>
-            <wp:effectExtent l="0" t="0" r="0" b="0"/>
+          <wp:inline distT="0" distB="0" distL="0" distR="0" wp14:anchorId="6C6B3F54" wp14:editId="5C726CCA">
+            <wp:extent cx="5663466" cy="2450538"/>
+            <wp:effectExtent l="0" t="0" r="0" b="6985"/>
             <wp:docPr id="1922697244" name="Picture 2"/>
             <wp:cNvGraphicFramePr>
               <a:graphicFrameLocks xmlns:a="http://schemas.openxmlformats.org/drawingml/2006/main" noChangeAspect="1"/>
@@ -94,7 +94,7 @@
                   <pic:spPr bwMode="auto">
                     <a:xfrm>
                       <a:off x="0" y="0"/>
-                      <a:ext cx="5943600" cy="2571750"/>
+                      <a:ext cx="5680793" cy="2458035"/>
                     </a:xfrm>
                     <a:prstGeom prst="rect">
                       <a:avLst/>
@@ -122,13 +122,7 @@
         <w:t xml:space="preserve"> by clicking on the form you want</w:t>
       </w:r>
       <w:r>
-        <w:t xml:space="preserve"> (left- or right-hand side, OR both </w:t>
-      </w:r>
-      <w:r>
-        <w:t xml:space="preserve">may be </w:t>
-      </w:r>
-      <w:r>
-        <w:t>valid)</w:t>
+        <w:t xml:space="preserve"> (left- or right-hand side, OR both may be valid)</w:t>
       </w:r>
       <w:r>
         <w:t xml:space="preserve">. </w:t>
@@ -151,14 +145,20 @@
     <w:p>
       <w:pPr>
         <w:jc w:val="center"/>
-      </w:pPr>
-      <w:r>
-        <w:rPr>
+        <w:rPr>
+          <w:i/>
+          <w:iCs/>
+        </w:rPr>
+      </w:pPr>
+      <w:r>
+        <w:rPr>
+          <w:i/>
+          <w:iCs/>
           <w:noProof/>
         </w:rPr>
         <w:drawing>
-          <wp:inline distT="0" distB="0" distL="0" distR="0" wp14:anchorId="577873EE" wp14:editId="43046839">
-            <wp:extent cx="5943600" cy="2324100"/>
+          <wp:inline distT="0" distB="0" distL="0" distR="0" wp14:anchorId="577873EE" wp14:editId="3A5A027E">
+            <wp:extent cx="5621182" cy="2198026"/>
             <wp:effectExtent l="0" t="0" r="0" b="0"/>
             <wp:docPr id="698706404" name="Picture 7"/>
             <wp:cNvGraphicFramePr>
@@ -189,7 +189,7 @@
                   <pic:spPr bwMode="auto">
                     <a:xfrm>
                       <a:off x="0" y="0"/>
-                      <a:ext cx="5943600" cy="2324100"/>
+                      <a:ext cx="5640020" cy="2205392"/>
                     </a:xfrm>
                     <a:prstGeom prst="rect">
                       <a:avLst/>
@@ -208,7 +208,18 @@
     </w:p>
     <w:p>
       <w:r>
-        <w:br w:type="page"/>
+        <w:t xml:space="preserve">contact </w:t>
+      </w:r>
+      <w:hyperlink r:id="rId10" w:history="1">
+        <w:r>
+          <w:rPr>
+            <w:rStyle w:val="Hyperlink"/>
+          </w:rPr>
+          <w:t>silconverters_support@sil.org</w:t>
+        </w:r>
+      </w:hyperlink>
+      <w:r>
+        <w:t xml:space="preserve"> if you have any questions or need help setting it up</w:t>
       </w:r>
     </w:p>
     <w:p>
@@ -398,7 +409,7 @@
       <w:r>
         <w:t xml:space="preserve">Fill in the information (contact </w:t>
       </w:r>
-      <w:hyperlink r:id="rId10" w:history="1">
+      <w:hyperlink r:id="rId11" w:history="1">
         <w:r>
           <w:rPr>
             <w:rStyle w:val="Hyperlink"/>
@@ -677,7 +688,7 @@
                     </pic:cNvPicPr>
                   </pic:nvPicPr>
                   <pic:blipFill>
-                    <a:blip r:embed="rId11">
+                    <a:blip r:embed="rId12">
                       <a:extLst>
                         <a:ext uri="{28A0092B-C50C-407E-A947-70E740481C1C}">
                           <a14:useLocalDpi xmlns:a14="http://schemas.microsoft.com/office/drawing/2010/main" val="0"/>
@@ -911,7 +922,7 @@
                     </pic:cNvPicPr>
                   </pic:nvPicPr>
                   <pic:blipFill>
-                    <a:blip r:embed="rId12">
+                    <a:blip r:embed="rId13">
                       <a:extLst>
                         <a:ext uri="{28A0092B-C50C-407E-A947-70E740481C1C}">
                           <a14:useLocalDpi xmlns:a14="http://schemas.microsoft.com/office/drawing/2010/main" val="0"/>
@@ -1038,7 +1049,7 @@
                     </pic:cNvPicPr>
                   </pic:nvPicPr>
                   <pic:blipFill>
-                    <a:blip r:embed="rId13">
+                    <a:blip r:embed="rId14">
                       <a:extLst>
                         <a:ext uri="{28A0092B-C50C-407E-A947-70E740481C1C}">
                           <a14:useLocalDpi xmlns:a14="http://schemas.microsoft.com/office/drawing/2010/main" val="0"/>
@@ -1106,7 +1117,7 @@
                     </pic:cNvPicPr>
                   </pic:nvPicPr>
                   <pic:blipFill>
-                    <a:blip r:embed="rId14">
+                    <a:blip r:embed="rId15">
                       <a:extLst>
                         <a:ext uri="{28A0092B-C50C-407E-A947-70E740481C1C}">
                           <a14:useLocalDpi xmlns:a14="http://schemas.microsoft.com/office/drawing/2010/main" val="0"/>
@@ -1161,7 +1172,7 @@
                     </pic:cNvPicPr>
                   </pic:nvPicPr>
                   <pic:blipFill>
-                    <a:blip r:embed="rId15">
+                    <a:blip r:embed="rId16">
                       <a:extLst>
                         <a:ext uri="{28A0092B-C50C-407E-A947-70E740481C1C}">
                           <a14:useLocalDpi xmlns:a14="http://schemas.microsoft.com/office/drawing/2010/main" val="0"/>
@@ -1240,7 +1251,7 @@
                     </pic:cNvPicPr>
                   </pic:nvPicPr>
                   <pic:blipFill>
-                    <a:blip r:embed="rId16">
+                    <a:blip r:embed="rId17">
                       <a:extLst>
                         <a:ext uri="{28A0092B-C50C-407E-A947-70E740481C1C}">
                           <a14:useLocalDpi xmlns:a14="http://schemas.microsoft.com/office/drawing/2010/main" val="0"/>
@@ -1308,7 +1319,7 @@
                     </pic:cNvPicPr>
                   </pic:nvPicPr>
                   <pic:blipFill>
-                    <a:blip r:embed="rId17">
+                    <a:blip r:embed="rId18">
                       <a:extLst>
                         <a:ext uri="{28A0092B-C50C-407E-A947-70E740481C1C}">
                           <a14:useLocalDpi xmlns:a14="http://schemas.microsoft.com/office/drawing/2010/main" val="0"/>
@@ -1390,7 +1401,7 @@
                     </pic:cNvPicPr>
                   </pic:nvPicPr>
                   <pic:blipFill>
-                    <a:blip r:embed="rId18">
+                    <a:blip r:embed="rId19">
                       <a:extLst>
                         <a:ext uri="{28A0092B-C50C-407E-A947-70E740481C1C}">
                           <a14:useLocalDpi xmlns:a14="http://schemas.microsoft.com/office/drawing/2010/main" val="0"/>
@@ -1492,7 +1503,7 @@
       <w:r>
         <w:t xml:space="preserve">Again, contact </w:t>
       </w:r>
-      <w:hyperlink r:id="rId19" w:history="1">
+      <w:hyperlink r:id="rId20" w:history="1">
         <w:r>
           <w:rPr>
             <w:rStyle w:val="Hyperlink"/>
@@ -3004,6 +3015,15 @@
 </file>
 
 <file path=customXml/item1.xml><?xml version="1.0" encoding="utf-8"?>
+<?mso-contentType ?>
+<FormTemplates xmlns="http://schemas.microsoft.com/sharepoint/v3/contenttype/forms">
+  <Display>DocumentLibraryForm</Display>
+  <Edit>DocumentLibraryForm</Edit>
+  <New>DocumentLibraryForm</New>
+</FormTemplates>
+</file>
+
+<file path=customXml/item2.xml><?xml version="1.0" encoding="utf-8"?>
 <ct:contentTypeSchema xmlns:ct="http://schemas.microsoft.com/office/2006/metadata/contentType" xmlns:ma="http://schemas.microsoft.com/office/2006/metadata/properties/metaAttributes" ct:_="" ma:_="" ma:contentTypeName="Document" ma:contentTypeID="0x01010074B6CF09B11D3949B42F4042C33BE902" ma:contentTypeVersion="14" ma:contentTypeDescription="Create a new document." ma:contentTypeScope="" ma:versionID="be397b6d2d39abac525edf355afb7151">
   <xsd:schema xmlns:xsd="http://www.w3.org/2001/XMLSchema" xmlns:xs="http://www.w3.org/2001/XMLSchema" xmlns:p="http://schemas.microsoft.com/office/2006/metadata/properties" xmlns:ns3="fb929304-db50-45bc-aa6f-2763aeeffb7f" xmlns:ns4="a798c4c7-d9b6-4ad1-b38e-d8af7099f1d2" targetNamespace="http://schemas.microsoft.com/office/2006/metadata/properties" ma:root="true" ma:fieldsID="3b0d2416cd9e38d6454382140edd267b" ns3:_="" ns4:_="">
     <xsd:import namespace="fb929304-db50-45bc-aa6f-2763aeeffb7f"/>
@@ -3228,15 +3248,6 @@
 </ct:contentTypeSchema>
 </file>
 
-<file path=customXml/item2.xml><?xml version="1.0" encoding="utf-8"?>
-<?mso-contentType ?>
-<FormTemplates xmlns="http://schemas.microsoft.com/sharepoint/v3/contenttype/forms">
-  <Display>DocumentLibraryForm</Display>
-  <Edit>DocumentLibraryForm</Edit>
-  <New>DocumentLibraryForm</New>
-</FormTemplates>
-</file>
-
 <file path=customXml/item3.xml><?xml version="1.0" encoding="utf-8"?>
 <p:properties xmlns:p="http://schemas.microsoft.com/office/2006/metadata/properties" xmlns:xsi="http://www.w3.org/2001/XMLSchema-instance" xmlns:pc="http://schemas.microsoft.com/office/infopath/2007/PartnerControls">
   <documentManagement>
@@ -3246,6 +3257,14 @@
 </file>
 
 <file path=customXml/itemProps1.xml><?xml version="1.0" encoding="utf-8"?>
+<ds:datastoreItem xmlns:ds="http://schemas.openxmlformats.org/officeDocument/2006/customXml" ds:itemID="{DDFE605D-3735-44D6-801D-CB47592B937A}">
+  <ds:schemaRefs>
+    <ds:schemaRef ds:uri="http://schemas.microsoft.com/sharepoint/v3/contenttype/forms"/>
+  </ds:schemaRefs>
+</ds:datastoreItem>
+</file>
+
+<file path=customXml/itemProps2.xml><?xml version="1.0" encoding="utf-8"?>
 <ds:datastoreItem xmlns:ds="http://schemas.openxmlformats.org/officeDocument/2006/customXml" ds:itemID="{C26511D5-C11C-41C3-A025-D4DA5DEA85C6}">
   <ds:schemaRefs>
     <ds:schemaRef ds:uri="http://schemas.microsoft.com/office/2006/metadata/contentType"/>
@@ -3264,14 +3283,6 @@
 </ds:datastoreItem>
 </file>
 
-<file path=customXml/itemProps2.xml><?xml version="1.0" encoding="utf-8"?>
-<ds:datastoreItem xmlns:ds="http://schemas.openxmlformats.org/officeDocument/2006/customXml" ds:itemID="{DDFE605D-3735-44D6-801D-CB47592B937A}">
-  <ds:schemaRefs>
-    <ds:schemaRef ds:uri="http://schemas.microsoft.com/sharepoint/v3/contenttype/forms"/>
-  </ds:schemaRefs>
-</ds:datastoreItem>
-</file>
-
 <file path=customXml/itemProps3.xml><?xml version="1.0" encoding="utf-8"?>
 <ds:datastoreItem xmlns:ds="http://schemas.openxmlformats.org/officeDocument/2006/customXml" ds:itemID="{E7B48EF8-D8D9-4DE0-8E80-2E4B827CF0EF}">
   <ds:schemaRefs>

</xml_diff>